<commit_message>
Fix Feature Guide gap: name Celebration Manager, Experience Planner, Family Companion explicitly
All 19 live AnA IQ features (per control-centre/featureGuide.ts) are now called
out by name with their own bullet; previously these three were only implicit
inside a generic "Book a Service sheet" bullet or missing entirely.
</commit_message>
<xml_diff>
--- a/docs/Final docs/AYANA_Feature_and_Navigation_Guide.docx
+++ b/docs/Final docs/AYANA_Feature_and_Navigation_Guide.docx
@@ -1031,6 +1031,36 @@
           <w:sz w:val="21"/>
           <w:szCs w:val="21"/>
         </w:rPr>
+        <w:t xml:space="preserve">Family Companion — </w:t>
+      </w:r>
+      <w:r>
+        <w:rPr>
+          <w:rFonts w:ascii="Calibri" w:cs="Calibri" w:eastAsia="Calibri" w:hAnsi="Calibri"/>
+          <w:color w:val="1A1A1A"/>
+          <w:sz w:val="21"/>
+          <w:szCs w:val="21"/>
+        </w:rPr>
+        <w:t xml:space="preserve">a Proactive Suggestion variant that only fires for a party actually travelling with a child who has flagged "Family Activities" as an interest — offers a supervised kid-friendly activity slot, never assumed from room size alone</w:t>
+      </w:r>
+    </w:p>
+    <w:p>
+      <w:pPr>
+        <w:pStyle w:val="ListParagraph"/>
+        <w:numPr>
+          <w:ilvl w:val="0"/>
+          <w:numId w:val="2"/>
+        </w:numPr>
+        <w:spacing w:after="40"/>
+      </w:pPr>
+      <w:r>
+        <w:rPr>
+          <w:rFonts w:ascii="Calibri" w:cs="Calibri" w:eastAsia="Calibri" w:hAnsi="Calibri"/>
+          <w:b/>
+          <w:bCs/>
+          <w:color w:val="1A1A1A"/>
+          <w:sz w:val="21"/>
+          <w:szCs w:val="21"/>
+        </w:rPr>
         <w:t xml:space="preserve">Learn My Preferences — </w:t>
       </w:r>
       <w:r>
@@ -1149,7 +1179,67 @@
           <w:sz w:val="21"/>
           <w:szCs w:val="21"/>
         </w:rPr>
-        <w:t xml:space="preserve">Book a Service sheet: Dining, Spa, Transport, Add-ons, Celebrations and Experiences tabs, all posting to the same live folio the kiosk and front desk share</w:t>
+        <w:t xml:space="preserve">Book a Service sheet: Dining, Spa, Transport and Add-ons tabs, all posting to the same live folio the kiosk and front desk share</w:t>
+      </w:r>
+    </w:p>
+    <w:p>
+      <w:pPr>
+        <w:pStyle w:val="ListParagraph"/>
+        <w:numPr>
+          <w:ilvl w:val="0"/>
+          <w:numId w:val="2"/>
+        </w:numPr>
+        <w:spacing w:after="40"/>
+      </w:pPr>
+      <w:r>
+        <w:rPr>
+          <w:rFonts w:ascii="Calibri" w:cs="Calibri" w:eastAsia="Calibri" w:hAnsi="Calibri"/>
+          <w:b/>
+          <w:bCs/>
+          <w:color w:val="1A1A1A"/>
+          <w:sz w:val="21"/>
+          <w:szCs w:val="21"/>
+        </w:rPr>
+        <w:t xml:space="preserve">Celebration Manager — </w:t>
+      </w:r>
+      <w:r>
+        <w:rPr>
+          <w:rFonts w:ascii="Calibri" w:cs="Calibri" w:eastAsia="Calibri" w:hAnsi="Calibri"/>
+          <w:color w:val="1A1A1A"/>
+          <w:sz w:val="21"/>
+          <w:szCs w:val="21"/>
+        </w:rPr>
+        <w:t xml:space="preserve">a structured intake (occasion, date, notes) for birthdays, anniversaries and surprise arrangements — its own tab in the Book a Service sheet</w:t>
+      </w:r>
+    </w:p>
+    <w:p>
+      <w:pPr>
+        <w:pStyle w:val="ListParagraph"/>
+        <w:numPr>
+          <w:ilvl w:val="0"/>
+          <w:numId w:val="2"/>
+        </w:numPr>
+        <w:spacing w:after="40"/>
+      </w:pPr>
+      <w:r>
+        <w:rPr>
+          <w:rFonts w:ascii="Calibri" w:cs="Calibri" w:eastAsia="Calibri" w:hAnsi="Calibri"/>
+          <w:b/>
+          <w:bCs/>
+          <w:color w:val="1A1A1A"/>
+          <w:sz w:val="21"/>
+          <w:szCs w:val="21"/>
+        </w:rPr>
+        <w:t xml:space="preserve">Experience Planner — </w:t>
+      </w:r>
+      <w:r>
+        <w:rPr>
+          <w:rFonts w:ascii="Calibri" w:cs="Calibri" w:eastAsia="Calibri" w:hAnsi="Calibri"/>
+          <w:color w:val="1A1A1A"/>
+          <w:sz w:val="21"/>
+          <w:szCs w:val="21"/>
+        </w:rPr>
+        <w:t xml:space="preserve">bookable tours and activities around the property — its own tab in the Book a Service sheet</w:t>
       </w:r>
     </w:p>
     <w:p>

</xml_diff>